<commit_message>
Define specialist capacity from NDB and JMSB data; add per-specialist FP burden; generate docx manuscript
Co-Authored-By: Tatsuki Onishi <bougtoir@gmail.com>
</commit_message>
<xml_diff>
--- a/cancer_screening_burden/manuscript/manuscript_tables.docx
+++ b/cancer_screening_burden/manuscript/manuscript_tables.docx
@@ -30,6 +30,7 @@
             <w:r>
               <w:rPr>
                 <w:b/>
+                <w:sz w:val="20"/>
               </w:rPr>
               <w:t>Parameter</w:t>
             </w:r>
@@ -43,6 +44,7 @@
             <w:r>
               <w:rPr>
                 <w:b/>
+                <w:sz w:val="20"/>
               </w:rPr>
               <w:t>Value</w:t>
             </w:r>
@@ -56,6 +58,7 @@
             <w:r>
               <w:rPr>
                 <w:b/>
+                <w:sz w:val="20"/>
               </w:rPr>
               <w:t>Source / assumption</w:t>
             </w:r>
@@ -69,6 +72,9 @@
           </w:tcPr>
           <w:p>
             <w:r>
+              <w:rPr>
+                <w:sz w:val="20"/>
+              </w:rPr>
               <w:t>Screened population</w:t>
             </w:r>
           </w:p>
@@ -79,6 +85,9 @@
           </w:tcPr>
           <w:p>
             <w:r>
+              <w:rPr>
+                <w:sz w:val="20"/>
+              </w:rPr>
               <w:t>100,000</w:t>
             </w:r>
           </w:p>
@@ -89,6 +98,9 @@
           </w:tcPr>
           <w:p>
             <w:r>
+              <w:rPr>
+                <w:sz w:val="20"/>
+              </w:rPr>
               <w:t>Model cohort</w:t>
             </w:r>
           </w:p>
@@ -101,6 +113,9 @@
           </w:tcPr>
           <w:p>
             <w:r>
+              <w:rPr>
+                <w:sz w:val="20"/>
+              </w:rPr>
               <w:t>Base sensitivity</w:t>
             </w:r>
           </w:p>
@@ -111,6 +126,9 @@
           </w:tcPr>
           <w:p>
             <w:r>
+              <w:rPr>
+                <w:sz w:val="20"/>
+              </w:rPr>
               <w:t>0.70</w:t>
             </w:r>
           </w:p>
@@ -121,6 +139,9 @@
           </w:tcPr>
           <w:p>
             <w:r>
+              <w:rPr>
+                <w:sz w:val="20"/>
+              </w:rPr>
               <w:t>Kahwati LC et al. Blood-Based Tests for Multiple Cancer Screening: A Systematic Review. AHRQ 2025. https://www.ncbi.nlm.nih.gov/books/NBK618307/</w:t>
             </w:r>
           </w:p>
@@ -133,6 +154,9 @@
           </w:tcPr>
           <w:p>
             <w:r>
+              <w:rPr>
+                <w:sz w:val="20"/>
+              </w:rPr>
               <w:t>Base specificity</w:t>
             </w:r>
           </w:p>
@@ -143,6 +167,9 @@
           </w:tcPr>
           <w:p>
             <w:r>
+              <w:rPr>
+                <w:sz w:val="20"/>
+              </w:rPr>
               <w:t>0.990</w:t>
             </w:r>
           </w:p>
@@ -153,6 +180,9 @@
           </w:tcPr>
           <w:p>
             <w:r>
+              <w:rPr>
+                <w:sz w:val="20"/>
+              </w:rPr>
               <w:t>Kahwati LC et al. Blood-Based Tests for Multiple Cancer Screening: A Systematic Review. AHRQ 2025. https://www.ncbi.nlm.nih.gov/books/NBK618307/</w:t>
             </w:r>
           </w:p>
@@ -165,6 +195,9 @@
           </w:tcPr>
           <w:p>
             <w:r>
+              <w:rPr>
+                <w:sz w:val="20"/>
+              </w:rPr>
               <w:t>CT capacity per 100k per year</w:t>
             </w:r>
           </w:p>
@@ -175,6 +208,9 @@
           </w:tcPr>
           <w:p>
             <w:r>
+              <w:rPr>
+                <w:sz w:val="20"/>
+              </w:rPr>
               <w:t>5676</w:t>
             </w:r>
           </w:p>
@@ -185,6 +221,9 @@
           </w:tcPr>
           <w:p>
             <w:r>
+              <w:rPr>
+                <w:sz w:val="20"/>
+              </w:rPr>
               <w:t>Ministry of Health, Labour and Welfare, 2023 Medical Facility Survey (Static/Dynamic), 05sisetu05.xlsx</w:t>
             </w:r>
           </w:p>
@@ -197,6 +236,9 @@
           </w:tcPr>
           <w:p>
             <w:r>
+              <w:rPr>
+                <w:sz w:val="20"/>
+              </w:rPr>
               <w:t>MRI capacity per 100k per year</w:t>
             </w:r>
           </w:p>
@@ -207,6 +249,9 @@
           </w:tcPr>
           <w:p>
             <w:r>
+              <w:rPr>
+                <w:sz w:val="20"/>
+              </w:rPr>
               <w:t>2678</w:t>
             </w:r>
           </w:p>
@@ -217,6 +262,9 @@
           </w:tcPr>
           <w:p>
             <w:r>
+              <w:rPr>
+                <w:sz w:val="20"/>
+              </w:rPr>
               <w:t>Ministry of Health, Labour and Welfare, 2023 Medical Facility Survey (Static/Dynamic), 05sisetu05.xlsx</w:t>
             </w:r>
           </w:p>
@@ -229,6 +277,9 @@
           </w:tcPr>
           <w:p>
             <w:r>
+              <w:rPr>
+                <w:sz w:val="20"/>
+              </w:rPr>
               <w:t>Endoscopy capacity per 100k per year</w:t>
             </w:r>
           </w:p>
@@ -239,6 +290,9 @@
           </w:tcPr>
           <w:p>
             <w:r>
+              <w:rPr>
+                <w:sz w:val="20"/>
+              </w:rPr>
               <w:t>2583</w:t>
             </w:r>
           </w:p>
@@ -249,6 +303,9 @@
           </w:tcPr>
           <w:p>
             <w:r>
+              <w:rPr>
+                <w:sz w:val="20"/>
+              </w:rPr>
               <w:t>Ministry of Health, Labour and Welfare, 2023 Medical Facility Survey (Static/Dynamic), 05sisetu05.xlsx</w:t>
             </w:r>
           </w:p>
@@ -261,6 +318,9 @@
           </w:tcPr>
           <w:p>
             <w:r>
+              <w:rPr>
+                <w:sz w:val="20"/>
+              </w:rPr>
               <w:t>Specialist capacity per 100k per year</w:t>
             </w:r>
           </w:p>
@@ -271,7 +331,10 @@
           </w:tcPr>
           <w:p>
             <w:r>
-              <w:t>8000</w:t>
+              <w:rPr>
+                <w:sz w:val="20"/>
+              </w:rPr>
+              <w:t>7183</w:t>
             </w:r>
           </w:p>
         </w:tc>
@@ -281,7 +344,10 @@
           </w:tcPr>
           <w:p>
             <w:r>
-              <w:t>Illustrative scenario assumption</w:t>
+              <w:rPr>
+                <w:sz w:val="20"/>
+              </w:rPr>
+              <w:t>Derived from NDB Open Data first/revisit outpatient patient counts (88,408,837 + 85,182,008) and 79,117 cancer-relevant JMSB specialists; 20% share assumed available for new cancer workups.</w:t>
             </w:r>
           </w:p>
         </w:tc>
@@ -293,6 +359,9 @@
           </w:tcPr>
           <w:p>
             <w:r>
+              <w:rPr>
+                <w:sz w:val="20"/>
+              </w:rPr>
               <w:t>Gastric prevalence (per 100k)</w:t>
             </w:r>
           </w:p>
@@ -303,6 +372,9 @@
           </w:tcPr>
           <w:p>
             <w:r>
+              <w:rPr>
+                <w:sz w:val="20"/>
+              </w:rPr>
               <w:t>84.3</w:t>
             </w:r>
           </w:p>
@@ -313,6 +385,9 @@
           </w:tcPr>
           <w:p>
             <w:r>
+              <w:rPr>
+                <w:sz w:val="20"/>
+              </w:rPr>
               <w:t>National Cancer Center of Japan, Cancer Statistics in Japan 2016-2023</w:t>
             </w:r>
           </w:p>
@@ -325,6 +400,9 @@
           </w:tcPr>
           <w:p>
             <w:r>
+              <w:rPr>
+                <w:sz w:val="20"/>
+              </w:rPr>
               <w:t>Colorectal prevalence (per 100k)</w:t>
             </w:r>
           </w:p>
@@ -335,6 +413,9 @@
           </w:tcPr>
           <w:p>
             <w:r>
+              <w:rPr>
+                <w:sz w:val="20"/>
+              </w:rPr>
               <w:t>123.8</w:t>
             </w:r>
           </w:p>
@@ -345,6 +426,9 @@
           </w:tcPr>
           <w:p>
             <w:r>
+              <w:rPr>
+                <w:sz w:val="20"/>
+              </w:rPr>
               <w:t>National Cancer Center of Japan, Cancer Statistics in Japan 2016-2023</w:t>
             </w:r>
           </w:p>
@@ -357,6 +441,9 @@
           </w:tcPr>
           <w:p>
             <w:r>
+              <w:rPr>
+                <w:sz w:val="20"/>
+              </w:rPr>
               <w:t>Lung prevalence (per 100k)</w:t>
             </w:r>
           </w:p>
@@ -367,6 +454,9 @@
           </w:tcPr>
           <w:p>
             <w:r>
+              <w:rPr>
+                <w:sz w:val="20"/>
+              </w:rPr>
               <w:t>99.7</w:t>
             </w:r>
           </w:p>
@@ -377,6 +467,9 @@
           </w:tcPr>
           <w:p>
             <w:r>
+              <w:rPr>
+                <w:sz w:val="20"/>
+              </w:rPr>
               <w:t>National Cancer Center of Japan, Cancer Statistics in Japan 2016-2023</w:t>
             </w:r>
           </w:p>
@@ -389,6 +482,9 @@
           </w:tcPr>
           <w:p>
             <w:r>
+              <w:rPr>
+                <w:sz w:val="20"/>
+              </w:rPr>
               <w:t>Breast prevalence (per 100k)</w:t>
             </w:r>
           </w:p>
@@ -399,6 +495,9 @@
           </w:tcPr>
           <w:p>
             <w:r>
+              <w:rPr>
+                <w:sz w:val="20"/>
+              </w:rPr>
               <w:t>83.2</w:t>
             </w:r>
           </w:p>
@@ -409,6 +508,9 @@
           </w:tcPr>
           <w:p>
             <w:r>
+              <w:rPr>
+                <w:sz w:val="20"/>
+              </w:rPr>
               <w:t>National Cancer Center of Japan, Cancer Statistics in Japan 2016-2023</w:t>
             </w:r>
           </w:p>
@@ -421,6 +523,9 @@
           </w:tcPr>
           <w:p>
             <w:r>
+              <w:rPr>
+                <w:sz w:val="20"/>
+              </w:rPr>
               <w:t>Prostate prevalence (per 100k)</w:t>
             </w:r>
           </w:p>
@@ -431,6 +536,9 @@
           </w:tcPr>
           <w:p>
             <w:r>
+              <w:rPr>
+                <w:sz w:val="20"/>
+              </w:rPr>
               <w:t>82.1</w:t>
             </w:r>
           </w:p>
@@ -441,6 +549,9 @@
           </w:tcPr>
           <w:p>
             <w:r>
+              <w:rPr>
+                <w:sz w:val="20"/>
+              </w:rPr>
               <w:t>National Cancer Center of Japan, Cancer Statistics in Japan 2016-2023</w:t>
             </w:r>
           </w:p>
@@ -453,6 +564,9 @@
           </w:tcPr>
           <w:p>
             <w:r>
+              <w:rPr>
+                <w:sz w:val="20"/>
+              </w:rPr>
               <w:t>Liver prevalence (per 100k)</w:t>
             </w:r>
           </w:p>
@@ -463,6 +577,9 @@
           </w:tcPr>
           <w:p>
             <w:r>
+              <w:rPr>
+                <w:sz w:val="20"/>
+              </w:rPr>
               <w:t>26.2</w:t>
             </w:r>
           </w:p>
@@ -473,6 +590,9 @@
           </w:tcPr>
           <w:p>
             <w:r>
+              <w:rPr>
+                <w:sz w:val="20"/>
+              </w:rPr>
               <w:t>National Cancer Center of Japan, Cancer Statistics in Japan 2016-2023</w:t>
             </w:r>
           </w:p>
@@ -485,6 +605,9 @@
           </w:tcPr>
           <w:p>
             <w:r>
+              <w:rPr>
+                <w:sz w:val="20"/>
+              </w:rPr>
               <w:t>Pancreatic prevalence (per 100k)</w:t>
             </w:r>
           </w:p>
@@ -495,6 +618,9 @@
           </w:tcPr>
           <w:p>
             <w:r>
+              <w:rPr>
+                <w:sz w:val="20"/>
+              </w:rPr>
               <w:t>38.2</w:t>
             </w:r>
           </w:p>
@@ -505,6 +631,9 @@
           </w:tcPr>
           <w:p>
             <w:r>
+              <w:rPr>
+                <w:sz w:val="20"/>
+              </w:rPr>
               <w:t>National Cancer Center of Japan, Cancer Statistics in Japan 2016-2023</w:t>
             </w:r>
           </w:p>
@@ -517,6 +646,9 @@
           </w:tcPr>
           <w:p>
             <w:r>
+              <w:rPr>
+                <w:sz w:val="20"/>
+              </w:rPr>
               <w:t>Ovarian prevalence (per 100k)</w:t>
             </w:r>
           </w:p>
@@ -527,6 +659,9 @@
           </w:tcPr>
           <w:p>
             <w:r>
+              <w:rPr>
+                <w:sz w:val="20"/>
+              </w:rPr>
               <w:t>10.3</w:t>
             </w:r>
           </w:p>
@@ -537,6 +672,9 @@
           </w:tcPr>
           <w:p>
             <w:r>
+              <w:rPr>
+                <w:sz w:val="20"/>
+              </w:rPr>
               <w:t>National Cancer Center of Japan, Cancer Statistics in Japan 2016-2023</w:t>
             </w:r>
           </w:p>
@@ -577,6 +715,7 @@
             <w:r>
               <w:rPr>
                 <w:b/>
+                <w:sz w:val="20"/>
               </w:rPr>
               <w:t>Cancer</w:t>
             </w:r>
@@ -590,6 +729,7 @@
             <w:r>
               <w:rPr>
                 <w:b/>
+                <w:sz w:val="20"/>
               </w:rPr>
               <w:t>Prevalence per 100k</w:t>
             </w:r>
@@ -603,6 +743,7 @@
             <w:r>
               <w:rPr>
                 <w:b/>
+                <w:sz w:val="20"/>
               </w:rPr>
               <w:t>True positives</w:t>
             </w:r>
@@ -616,6 +757,7 @@
             <w:r>
               <w:rPr>
                 <w:b/>
+                <w:sz w:val="20"/>
               </w:rPr>
               <w:t>False positives</w:t>
             </w:r>
@@ -629,6 +771,7 @@
             <w:r>
               <w:rPr>
                 <w:b/>
+                <w:sz w:val="20"/>
               </w:rPr>
               <w:t>PPV (%)</w:t>
             </w:r>
@@ -642,6 +785,7 @@
             <w:r>
               <w:rPr>
                 <w:b/>
+                <w:sz w:val="20"/>
               </w:rPr>
               <w:t>FP/TP ratio</w:t>
             </w:r>
@@ -655,6 +799,7 @@
             <w:r>
               <w:rPr>
                 <w:b/>
+                <w:sz w:val="20"/>
               </w:rPr>
               <w:t>Total visits</w:t>
             </w:r>
@@ -668,6 +813,7 @@
             <w:r>
               <w:rPr>
                 <w:b/>
+                <w:sz w:val="20"/>
               </w:rPr>
               <w:t>Max resource utilisation (%)</w:t>
             </w:r>
@@ -681,6 +827,9 @@
           </w:tcPr>
           <w:p>
             <w:r>
+              <w:rPr>
+                <w:sz w:val="20"/>
+              </w:rPr>
               <w:t>Gastric</w:t>
             </w:r>
           </w:p>
@@ -691,6 +840,9 @@
           </w:tcPr>
           <w:p>
             <w:r>
+              <w:rPr>
+                <w:sz w:val="20"/>
+              </w:rPr>
               <w:t>84.3</w:t>
             </w:r>
           </w:p>
@@ -701,6 +853,9 @@
           </w:tcPr>
           <w:p>
             <w:r>
+              <w:rPr>
+                <w:sz w:val="20"/>
+              </w:rPr>
               <w:t>59.0</w:t>
             </w:r>
           </w:p>
@@ -711,6 +866,9 @@
           </w:tcPr>
           <w:p>
             <w:r>
+              <w:rPr>
+                <w:sz w:val="20"/>
+              </w:rPr>
               <w:t>999.2</w:t>
             </w:r>
           </w:p>
@@ -721,6 +879,9 @@
           </w:tcPr>
           <w:p>
             <w:r>
+              <w:rPr>
+                <w:sz w:val="20"/>
+              </w:rPr>
               <w:t>5.60</w:t>
             </w:r>
           </w:p>
@@ -731,6 +892,9 @@
           </w:tcPr>
           <w:p>
             <w:r>
+              <w:rPr>
+                <w:sz w:val="20"/>
+              </w:rPr>
               <w:t>16.9</w:t>
             </w:r>
           </w:p>
@@ -741,6 +905,9 @@
           </w:tcPr>
           <w:p>
             <w:r>
+              <w:rPr>
+                <w:sz w:val="20"/>
+              </w:rPr>
               <w:t>2084.3</w:t>
             </w:r>
           </w:p>
@@ -751,7 +918,10 @@
           </w:tcPr>
           <w:p>
             <w:r>
-              <w:t>18.4</w:t>
+              <w:rPr>
+                <w:sz w:val="20"/>
+              </w:rPr>
+              <w:t>19.4</w:t>
             </w:r>
           </w:p>
         </w:tc>
@@ -763,6 +933,9 @@
           </w:tcPr>
           <w:p>
             <w:r>
+              <w:rPr>
+                <w:sz w:val="20"/>
+              </w:rPr>
               <w:t>Colorectal</w:t>
             </w:r>
           </w:p>
@@ -773,6 +946,9 @@
           </w:tcPr>
           <w:p>
             <w:r>
+              <w:rPr>
+                <w:sz w:val="20"/>
+              </w:rPr>
               <w:t>123.8</w:t>
             </w:r>
           </w:p>
@@ -783,6 +959,9 @@
           </w:tcPr>
           <w:p>
             <w:r>
+              <w:rPr>
+                <w:sz w:val="20"/>
+              </w:rPr>
               <w:t>86.7</w:t>
             </w:r>
           </w:p>
@@ -793,6 +972,9 @@
           </w:tcPr>
           <w:p>
             <w:r>
+              <w:rPr>
+                <w:sz w:val="20"/>
+              </w:rPr>
               <w:t>998.8</w:t>
             </w:r>
           </w:p>
@@ -803,6 +985,9 @@
           </w:tcPr>
           <w:p>
             <w:r>
+              <w:rPr>
+                <w:sz w:val="20"/>
+              </w:rPr>
               <w:t>8.00</w:t>
             </w:r>
           </w:p>
@@ -813,6 +998,9 @@
           </w:tcPr>
           <w:p>
             <w:r>
+              <w:rPr>
+                <w:sz w:val="20"/>
+              </w:rPr>
               <w:t>11.5</w:t>
             </w:r>
           </w:p>
@@ -823,6 +1011,9 @@
           </w:tcPr>
           <w:p>
             <w:r>
+              <w:rPr>
+                <w:sz w:val="20"/>
+              </w:rPr>
               <w:t>2170.7</w:t>
             </w:r>
           </w:p>
@@ -833,7 +1024,10 @@
           </w:tcPr>
           <w:p>
             <w:r>
-              <w:t>20.0</w:t>
+              <w:rPr>
+                <w:sz w:val="20"/>
+              </w:rPr>
+              <w:t>20.4</w:t>
             </w:r>
           </w:p>
         </w:tc>
@@ -845,6 +1039,9 @@
           </w:tcPr>
           <w:p>
             <w:r>
+              <w:rPr>
+                <w:sz w:val="20"/>
+              </w:rPr>
               <w:t>Lung</w:t>
             </w:r>
           </w:p>
@@ -855,6 +1052,9 @@
           </w:tcPr>
           <w:p>
             <w:r>
+              <w:rPr>
+                <w:sz w:val="20"/>
+              </w:rPr>
               <w:t>99.7</w:t>
             </w:r>
           </w:p>
@@ -865,6 +1065,9 @@
           </w:tcPr>
           <w:p>
             <w:r>
+              <w:rPr>
+                <w:sz w:val="20"/>
+              </w:rPr>
               <w:t>69.8</w:t>
             </w:r>
           </w:p>
@@ -875,6 +1078,9 @@
           </w:tcPr>
           <w:p>
             <w:r>
+              <w:rPr>
+                <w:sz w:val="20"/>
+              </w:rPr>
               <w:t>999.0</w:t>
             </w:r>
           </w:p>
@@ -885,6 +1091,9 @@
           </w:tcPr>
           <w:p>
             <w:r>
+              <w:rPr>
+                <w:sz w:val="20"/>
+              </w:rPr>
               <w:t>6.50</w:t>
             </w:r>
           </w:p>
@@ -895,6 +1104,9 @@
           </w:tcPr>
           <w:p>
             <w:r>
+              <w:rPr>
+                <w:sz w:val="20"/>
+              </w:rPr>
               <w:t>14.3</w:t>
             </w:r>
           </w:p>
@@ -905,6 +1117,9 @@
           </w:tcPr>
           <w:p>
             <w:r>
+              <w:rPr>
+                <w:sz w:val="20"/>
+              </w:rPr>
               <w:t>2295.7</w:t>
             </w:r>
           </w:p>
@@ -915,7 +1130,10 @@
           </w:tcPr>
           <w:p>
             <w:r>
-              <w:t>21.3</w:t>
+              <w:rPr>
+                <w:sz w:val="20"/>
+              </w:rPr>
+              <w:t>23.8</w:t>
             </w:r>
           </w:p>
         </w:tc>
@@ -927,6 +1145,9 @@
           </w:tcPr>
           <w:p>
             <w:r>
+              <w:rPr>
+                <w:sz w:val="20"/>
+              </w:rPr>
               <w:t>Breast</w:t>
             </w:r>
           </w:p>
@@ -937,6 +1158,9 @@
           </w:tcPr>
           <w:p>
             <w:r>
+              <w:rPr>
+                <w:sz w:val="20"/>
+              </w:rPr>
               <w:t>83.2</w:t>
             </w:r>
           </w:p>
@@ -947,6 +1171,9 @@
           </w:tcPr>
           <w:p>
             <w:r>
+              <w:rPr>
+                <w:sz w:val="20"/>
+              </w:rPr>
               <w:t>58.2</w:t>
             </w:r>
           </w:p>
@@ -957,6 +1184,9 @@
           </w:tcPr>
           <w:p>
             <w:r>
+              <w:rPr>
+                <w:sz w:val="20"/>
+              </w:rPr>
               <w:t>999.2</w:t>
             </w:r>
           </w:p>
@@ -967,6 +1197,9 @@
           </w:tcPr>
           <w:p>
             <w:r>
+              <w:rPr>
+                <w:sz w:val="20"/>
+              </w:rPr>
               <w:t>5.50</w:t>
             </w:r>
           </w:p>
@@ -977,6 +1210,9 @@
           </w:tcPr>
           <w:p>
             <w:r>
+              <w:rPr>
+                <w:sz w:val="20"/>
+              </w:rPr>
               <w:t>17.2</w:t>
             </w:r>
           </w:p>
@@ -987,6 +1223,9 @@
           </w:tcPr>
           <w:p>
             <w:r>
+              <w:rPr>
+                <w:sz w:val="20"/>
+              </w:rPr>
               <w:t>1632.4</w:t>
             </w:r>
           </w:p>
@@ -997,7 +1236,10 @@
           </w:tcPr>
           <w:p>
             <w:r>
-              <w:t>17.4</w:t>
+              <w:rPr>
+                <w:sz w:val="20"/>
+              </w:rPr>
+              <w:t>19.4</w:t>
             </w:r>
           </w:p>
         </w:tc>
@@ -1009,6 +1251,9 @@
           </w:tcPr>
           <w:p>
             <w:r>
+              <w:rPr>
+                <w:sz w:val="20"/>
+              </w:rPr>
               <w:t>Prostate</w:t>
             </w:r>
           </w:p>
@@ -1019,6 +1264,9 @@
           </w:tcPr>
           <w:p>
             <w:r>
+              <w:rPr>
+                <w:sz w:val="20"/>
+              </w:rPr>
               <w:t>82.1</w:t>
             </w:r>
           </w:p>
@@ -1029,6 +1277,9 @@
           </w:tcPr>
           <w:p>
             <w:r>
+              <w:rPr>
+                <w:sz w:val="20"/>
+              </w:rPr>
               <w:t>57.5</w:t>
             </w:r>
           </w:p>
@@ -1039,6 +1290,9 @@
           </w:tcPr>
           <w:p>
             <w:r>
+              <w:rPr>
+                <w:sz w:val="20"/>
+              </w:rPr>
               <w:t>999.2</w:t>
             </w:r>
           </w:p>
@@ -1049,6 +1303,9 @@
           </w:tcPr>
           <w:p>
             <w:r>
+              <w:rPr>
+                <w:sz w:val="20"/>
+              </w:rPr>
               <w:t>5.40</w:t>
             </w:r>
           </w:p>
@@ -1059,6 +1316,9 @@
           </w:tcPr>
           <w:p>
             <w:r>
+              <w:rPr>
+                <w:sz w:val="20"/>
+              </w:rPr>
               <w:t>17.4</w:t>
             </w:r>
           </w:p>
@@ -1069,6 +1329,9 @@
           </w:tcPr>
           <w:p>
             <w:r>
+              <w:rPr>
+                <w:sz w:val="20"/>
+              </w:rPr>
               <w:t>1654.5</w:t>
             </w:r>
           </w:p>
@@ -1079,7 +1342,10 @@
           </w:tcPr>
           <w:p>
             <w:r>
-              <w:t>17.0</w:t>
+              <w:rPr>
+                <w:sz w:val="20"/>
+              </w:rPr>
+              <w:t>19.0</w:t>
             </w:r>
           </w:p>
         </w:tc>
@@ -1091,6 +1357,9 @@
           </w:tcPr>
           <w:p>
             <w:r>
+              <w:rPr>
+                <w:sz w:val="20"/>
+              </w:rPr>
               <w:t>Liver</w:t>
             </w:r>
           </w:p>
@@ -1101,6 +1370,9 @@
           </w:tcPr>
           <w:p>
             <w:r>
+              <w:rPr>
+                <w:sz w:val="20"/>
+              </w:rPr>
               <w:t>26.2</w:t>
             </w:r>
           </w:p>
@@ -1111,6 +1383,9 @@
           </w:tcPr>
           <w:p>
             <w:r>
+              <w:rPr>
+                <w:sz w:val="20"/>
+              </w:rPr>
               <w:t>18.4</w:t>
             </w:r>
           </w:p>
@@ -1121,6 +1396,9 @@
           </w:tcPr>
           <w:p>
             <w:r>
+              <w:rPr>
+                <w:sz w:val="20"/>
+              </w:rPr>
               <w:t>999.7</w:t>
             </w:r>
           </w:p>
@@ -1131,6 +1409,9 @@
           </w:tcPr>
           <w:p>
             <w:r>
+              <w:rPr>
+                <w:sz w:val="20"/>
+              </w:rPr>
               <w:t>1.80</w:t>
             </w:r>
           </w:p>
@@ -1141,6 +1422,9 @@
           </w:tcPr>
           <w:p>
             <w:r>
+              <w:rPr>
+                <w:sz w:val="20"/>
+              </w:rPr>
               <w:t>54.4</w:t>
             </w:r>
           </w:p>
@@ -1151,6 +1435,9 @@
           </w:tcPr>
           <w:p>
             <w:r>
+              <w:rPr>
+                <w:sz w:val="20"/>
+              </w:rPr>
               <w:t>1702.8</w:t>
             </w:r>
           </w:p>
@@ -1161,7 +1448,10 @@
           </w:tcPr>
           <w:p>
             <w:r>
-              <w:t>16.2</w:t>
+              <w:rPr>
+                <w:sz w:val="20"/>
+              </w:rPr>
+              <w:t>18.0</w:t>
             </w:r>
           </w:p>
         </w:tc>
@@ -1173,6 +1463,9 @@
           </w:tcPr>
           <w:p>
             <w:r>
+              <w:rPr>
+                <w:sz w:val="20"/>
+              </w:rPr>
               <w:t>Pancreatic</w:t>
             </w:r>
           </w:p>
@@ -1183,6 +1476,9 @@
           </w:tcPr>
           <w:p>
             <w:r>
+              <w:rPr>
+                <w:sz w:val="20"/>
+              </w:rPr>
               <w:t>38.2</w:t>
             </w:r>
           </w:p>
@@ -1193,6 +1489,9 @@
           </w:tcPr>
           <w:p>
             <w:r>
+              <w:rPr>
+                <w:sz w:val="20"/>
+              </w:rPr>
               <w:t>26.7</w:t>
             </w:r>
           </w:p>
@@ -1203,6 +1502,9 @@
           </w:tcPr>
           <w:p>
             <w:r>
+              <w:rPr>
+                <w:sz w:val="20"/>
+              </w:rPr>
               <w:t>999.6</w:t>
             </w:r>
           </w:p>
@@ -1213,6 +1515,9 @@
           </w:tcPr>
           <w:p>
             <w:r>
+              <w:rPr>
+                <w:sz w:val="20"/>
+              </w:rPr>
               <w:t>2.60</w:t>
             </w:r>
           </w:p>
@@ -1223,6 +1528,9 @@
           </w:tcPr>
           <w:p>
             <w:r>
+              <w:rPr>
+                <w:sz w:val="20"/>
+              </w:rPr>
               <w:t>37.4</w:t>
             </w:r>
           </w:p>
@@ -1233,6 +1541,9 @@
           </w:tcPr>
           <w:p>
             <w:r>
+              <w:rPr>
+                <w:sz w:val="20"/>
+              </w:rPr>
               <w:t>2144.1</w:t>
             </w:r>
           </w:p>
@@ -1243,7 +1554,10 @@
           </w:tcPr>
           <w:p>
             <w:r>
-              <w:t>19.7</w:t>
+              <w:rPr>
+                <w:sz w:val="20"/>
+              </w:rPr>
+              <w:t>22.0</w:t>
             </w:r>
           </w:p>
         </w:tc>
@@ -1255,6 +1569,9 @@
           </w:tcPr>
           <w:p>
             <w:r>
+              <w:rPr>
+                <w:sz w:val="20"/>
+              </w:rPr>
               <w:t>Ovarian</w:t>
             </w:r>
           </w:p>
@@ -1265,6 +1582,9 @@
           </w:tcPr>
           <w:p>
             <w:r>
+              <w:rPr>
+                <w:sz w:val="20"/>
+              </w:rPr>
               <w:t>10.3</w:t>
             </w:r>
           </w:p>
@@ -1275,6 +1595,9 @@
           </w:tcPr>
           <w:p>
             <w:r>
+              <w:rPr>
+                <w:sz w:val="20"/>
+              </w:rPr>
               <w:t>7.2</w:t>
             </w:r>
           </w:p>
@@ -1285,6 +1608,9 @@
           </w:tcPr>
           <w:p>
             <w:r>
+              <w:rPr>
+                <w:sz w:val="20"/>
+              </w:rPr>
               <w:t>999.9</w:t>
             </w:r>
           </w:p>
@@ -1295,6 +1621,9 @@
           </w:tcPr>
           <w:p>
             <w:r>
+              <w:rPr>
+                <w:sz w:val="20"/>
+              </w:rPr>
               <w:t>0.70</w:t>
             </w:r>
           </w:p>
@@ -1305,6 +1634,9 @@
           </w:tcPr>
           <w:p>
             <w:r>
+              <w:rPr>
+                <w:sz w:val="20"/>
+              </w:rPr>
               <w:t>137.4</w:t>
             </w:r>
           </w:p>
@@ -1315,6 +1647,9 @@
           </w:tcPr>
           <w:p>
             <w:r>
+              <w:rPr>
+                <w:sz w:val="20"/>
+              </w:rPr>
               <w:t>1999.8</w:t>
             </w:r>
           </w:p>
@@ -1325,7 +1660,10 @@
           </w:tcPr>
           <w:p>
             <w:r>
-              <w:t>19.0</w:t>
+              <w:rPr>
+                <w:sz w:val="20"/>
+              </w:rPr>
+              <w:t>21.2</w:t>
             </w:r>
           </w:p>
         </w:tc>
@@ -1365,6 +1703,7 @@
             <w:r>
               <w:rPr>
                 <w:b/>
+                <w:sz w:val="20"/>
               </w:rPr>
               <w:t>Follow-up rate</w:t>
             </w:r>
@@ -1378,6 +1717,7 @@
             <w:r>
               <w:rPr>
                 <w:b/>
+                <w:sz w:val="20"/>
               </w:rPr>
               <w:t>True positives</w:t>
             </w:r>
@@ -1391,6 +1731,7 @@
             <w:r>
               <w:rPr>
                 <w:b/>
+                <w:sz w:val="20"/>
               </w:rPr>
               <w:t>False positives</w:t>
             </w:r>
@@ -1404,6 +1745,7 @@
             <w:r>
               <w:rPr>
                 <w:b/>
+                <w:sz w:val="20"/>
               </w:rPr>
               <w:t>Total positives</w:t>
             </w:r>
@@ -1417,6 +1759,7 @@
             <w:r>
               <w:rPr>
                 <w:b/>
+                <w:sz w:val="20"/>
               </w:rPr>
               <w:t>PPV (%)</w:t>
             </w:r>
@@ -1430,6 +1773,7 @@
             <w:r>
               <w:rPr>
                 <w:b/>
+                <w:sz w:val="20"/>
               </w:rPr>
               <w:t>FP/TP ratio</w:t>
             </w:r>
@@ -1443,6 +1787,7 @@
             <w:r>
               <w:rPr>
                 <w:b/>
+                <w:sz w:val="20"/>
               </w:rPr>
               <w:t>Total visits</w:t>
             </w:r>
@@ -1456,6 +1801,7 @@
             <w:r>
               <w:rPr>
                 <w:b/>
+                <w:sz w:val="20"/>
               </w:rPr>
               <w:t>Max capacity utilisation (%)</w:t>
             </w:r>
@@ -1469,6 +1815,9 @@
           </w:tcPr>
           <w:p>
             <w:r>
+              <w:rPr>
+                <w:sz w:val="20"/>
+              </w:rPr>
               <w:t>0%</w:t>
             </w:r>
           </w:p>
@@ -1479,6 +1828,9 @@
           </w:tcPr>
           <w:p>
             <w:r>
+              <w:rPr>
+                <w:sz w:val="20"/>
+              </w:rPr>
               <w:t>383.5</w:t>
             </w:r>
           </w:p>
@@ -1489,6 +1841,9 @@
           </w:tcPr>
           <w:p>
             <w:r>
+              <w:rPr>
+                <w:sz w:val="20"/>
+              </w:rPr>
               <w:t>7994.5</w:t>
             </w:r>
           </w:p>
@@ -1499,6 +1854,9 @@
           </w:tcPr>
           <w:p>
             <w:r>
+              <w:rPr>
+                <w:sz w:val="20"/>
+              </w:rPr>
               <w:t>8378.0</w:t>
             </w:r>
           </w:p>
@@ -1509,6 +1867,9 @@
           </w:tcPr>
           <w:p>
             <w:r>
+              <w:rPr>
+                <w:sz w:val="20"/>
+              </w:rPr>
               <w:t>4.60</w:t>
             </w:r>
           </w:p>
@@ -1519,6 +1880,9 @@
           </w:tcPr>
           <w:p>
             <w:r>
+              <w:rPr>
+                <w:sz w:val="20"/>
+              </w:rPr>
               <w:t>20.8</w:t>
             </w:r>
           </w:p>
@@ -1529,6 +1893,9 @@
           </w:tcPr>
           <w:p>
             <w:r>
+              <w:rPr>
+                <w:sz w:val="20"/>
+              </w:rPr>
               <w:t>0.0</w:t>
             </w:r>
           </w:p>
@@ -1539,6 +1906,9 @@
           </w:tcPr>
           <w:p>
             <w:r>
+              <w:rPr>
+                <w:sz w:val="20"/>
+              </w:rPr>
               <w:t>0.0</w:t>
             </w:r>
           </w:p>
@@ -1551,6 +1921,9 @@
           </w:tcPr>
           <w:p>
             <w:r>
+              <w:rPr>
+                <w:sz w:val="20"/>
+              </w:rPr>
               <w:t>10%</w:t>
             </w:r>
           </w:p>
@@ -1561,6 +1934,9 @@
           </w:tcPr>
           <w:p>
             <w:r>
+              <w:rPr>
+                <w:sz w:val="20"/>
+              </w:rPr>
               <w:t>383.5</w:t>
             </w:r>
           </w:p>
@@ -1571,6 +1947,9 @@
           </w:tcPr>
           <w:p>
             <w:r>
+              <w:rPr>
+                <w:sz w:val="20"/>
+              </w:rPr>
               <w:t>7994.5</w:t>
             </w:r>
           </w:p>
@@ -1581,6 +1960,9 @@
           </w:tcPr>
           <w:p>
             <w:r>
+              <w:rPr>
+                <w:sz w:val="20"/>
+              </w:rPr>
               <w:t>8378.0</w:t>
             </w:r>
           </w:p>
@@ -1591,6 +1973,9 @@
           </w:tcPr>
           <w:p>
             <w:r>
+              <w:rPr>
+                <w:sz w:val="20"/>
+              </w:rPr>
               <w:t>4.60</w:t>
             </w:r>
           </w:p>
@@ -1601,6 +1986,9 @@
           </w:tcPr>
           <w:p>
             <w:r>
+              <w:rPr>
+                <w:sz w:val="20"/>
+              </w:rPr>
               <w:t>20.8</w:t>
             </w:r>
           </w:p>
@@ -1611,6 +1999,9 @@
           </w:tcPr>
           <w:p>
             <w:r>
+              <w:rPr>
+                <w:sz w:val="20"/>
+              </w:rPr>
               <w:t>3136.9</w:t>
             </w:r>
           </w:p>
@@ -1621,7 +2012,10 @@
           </w:tcPr>
           <w:p>
             <w:r>
-              <w:t>29.3</w:t>
+              <w:rPr>
+                <w:sz w:val="20"/>
+              </w:rPr>
+              <w:t>32.6</w:t>
             </w:r>
           </w:p>
         </w:tc>
@@ -1633,6 +2027,9 @@
           </w:tcPr>
           <w:p>
             <w:r>
+              <w:rPr>
+                <w:sz w:val="20"/>
+              </w:rPr>
               <w:t>20%</w:t>
             </w:r>
           </w:p>
@@ -1643,6 +2040,9 @@
           </w:tcPr>
           <w:p>
             <w:r>
+              <w:rPr>
+                <w:sz w:val="20"/>
+              </w:rPr>
               <w:t>383.5</w:t>
             </w:r>
           </w:p>
@@ -1653,6 +2053,9 @@
           </w:tcPr>
           <w:p>
             <w:r>
+              <w:rPr>
+                <w:sz w:val="20"/>
+              </w:rPr>
               <w:t>7994.5</w:t>
             </w:r>
           </w:p>
@@ -1663,6 +2066,9 @@
           </w:tcPr>
           <w:p>
             <w:r>
+              <w:rPr>
+                <w:sz w:val="20"/>
+              </w:rPr>
               <w:t>8378.0</w:t>
             </w:r>
           </w:p>
@@ -1673,6 +2079,9 @@
           </w:tcPr>
           <w:p>
             <w:r>
+              <w:rPr>
+                <w:sz w:val="20"/>
+              </w:rPr>
               <w:t>4.60</w:t>
             </w:r>
           </w:p>
@@ -1683,6 +2092,9 @@
           </w:tcPr>
           <w:p>
             <w:r>
+              <w:rPr>
+                <w:sz w:val="20"/>
+              </w:rPr>
               <w:t>20.8</w:t>
             </w:r>
           </w:p>
@@ -1693,6 +2105,9 @@
           </w:tcPr>
           <w:p>
             <w:r>
+              <w:rPr>
+                <w:sz w:val="20"/>
+              </w:rPr>
               <w:t>6273.8</w:t>
             </w:r>
           </w:p>
@@ -1703,7 +2118,10 @@
           </w:tcPr>
           <w:p>
             <w:r>
-              <w:t>58.6</w:t>
+              <w:rPr>
+                <w:sz w:val="20"/>
+              </w:rPr>
+              <w:t>65.3</w:t>
             </w:r>
           </w:p>
         </w:tc>
@@ -1715,6 +2133,9 @@
           </w:tcPr>
           <w:p>
             <w:r>
+              <w:rPr>
+                <w:sz w:val="20"/>
+              </w:rPr>
               <w:t>30%</w:t>
             </w:r>
           </w:p>
@@ -1725,6 +2146,9 @@
           </w:tcPr>
           <w:p>
             <w:r>
+              <w:rPr>
+                <w:sz w:val="20"/>
+              </w:rPr>
               <w:t>383.5</w:t>
             </w:r>
           </w:p>
@@ -1735,6 +2159,9 @@
           </w:tcPr>
           <w:p>
             <w:r>
+              <w:rPr>
+                <w:sz w:val="20"/>
+              </w:rPr>
               <w:t>7994.5</w:t>
             </w:r>
           </w:p>
@@ -1745,6 +2172,9 @@
           </w:tcPr>
           <w:p>
             <w:r>
+              <w:rPr>
+                <w:sz w:val="20"/>
+              </w:rPr>
               <w:t>8378.0</w:t>
             </w:r>
           </w:p>
@@ -1755,6 +2185,9 @@
           </w:tcPr>
           <w:p>
             <w:r>
+              <w:rPr>
+                <w:sz w:val="20"/>
+              </w:rPr>
               <w:t>4.60</w:t>
             </w:r>
           </w:p>
@@ -1765,6 +2198,9 @@
           </w:tcPr>
           <w:p>
             <w:r>
+              <w:rPr>
+                <w:sz w:val="20"/>
+              </w:rPr>
               <w:t>20.8</w:t>
             </w:r>
           </w:p>
@@ -1775,6 +2211,9 @@
           </w:tcPr>
           <w:p>
             <w:r>
+              <w:rPr>
+                <w:sz w:val="20"/>
+              </w:rPr>
               <w:t>9410.6</w:t>
             </w:r>
           </w:p>
@@ -1785,7 +2224,10 @@
           </w:tcPr>
           <w:p>
             <w:r>
-              <w:t>87.9</w:t>
+              <w:rPr>
+                <w:sz w:val="20"/>
+              </w:rPr>
+              <w:t>97.9</w:t>
             </w:r>
           </w:p>
         </w:tc>
@@ -1797,6 +2239,9 @@
           </w:tcPr>
           <w:p>
             <w:r>
+              <w:rPr>
+                <w:sz w:val="20"/>
+              </w:rPr>
               <w:t>40%</w:t>
             </w:r>
           </w:p>
@@ -1807,6 +2252,9 @@
           </w:tcPr>
           <w:p>
             <w:r>
+              <w:rPr>
+                <w:sz w:val="20"/>
+              </w:rPr>
               <w:t>383.5</w:t>
             </w:r>
           </w:p>
@@ -1817,6 +2265,9 @@
           </w:tcPr>
           <w:p>
             <w:r>
+              <w:rPr>
+                <w:sz w:val="20"/>
+              </w:rPr>
               <w:t>7994.5</w:t>
             </w:r>
           </w:p>
@@ -1827,6 +2278,9 @@
           </w:tcPr>
           <w:p>
             <w:r>
+              <w:rPr>
+                <w:sz w:val="20"/>
+              </w:rPr>
               <w:t>8378.0</w:t>
             </w:r>
           </w:p>
@@ -1837,6 +2291,9 @@
           </w:tcPr>
           <w:p>
             <w:r>
+              <w:rPr>
+                <w:sz w:val="20"/>
+              </w:rPr>
               <w:t>4.60</w:t>
             </w:r>
           </w:p>
@@ -1847,6 +2304,9 @@
           </w:tcPr>
           <w:p>
             <w:r>
+              <w:rPr>
+                <w:sz w:val="20"/>
+              </w:rPr>
               <w:t>20.8</w:t>
             </w:r>
           </w:p>
@@ -1857,6 +2317,9 @@
           </w:tcPr>
           <w:p>
             <w:r>
+              <w:rPr>
+                <w:sz w:val="20"/>
+              </w:rPr>
               <w:t>12547.5</w:t>
             </w:r>
           </w:p>
@@ -1867,7 +2330,10 @@
           </w:tcPr>
           <w:p>
             <w:r>
-              <w:t>117.2</w:t>
+              <w:rPr>
+                <w:sz w:val="20"/>
+              </w:rPr>
+              <w:t>130.6</w:t>
             </w:r>
           </w:p>
         </w:tc>
@@ -1879,6 +2345,9 @@
           </w:tcPr>
           <w:p>
             <w:r>
+              <w:rPr>
+                <w:sz w:val="20"/>
+              </w:rPr>
               <w:t>50%</w:t>
             </w:r>
           </w:p>
@@ -1889,6 +2358,9 @@
           </w:tcPr>
           <w:p>
             <w:r>
+              <w:rPr>
+                <w:sz w:val="20"/>
+              </w:rPr>
               <w:t>383.5</w:t>
             </w:r>
           </w:p>
@@ -1899,6 +2371,9 @@
           </w:tcPr>
           <w:p>
             <w:r>
+              <w:rPr>
+                <w:sz w:val="20"/>
+              </w:rPr>
               <w:t>7994.5</w:t>
             </w:r>
           </w:p>
@@ -1909,6 +2384,9 @@
           </w:tcPr>
           <w:p>
             <w:r>
+              <w:rPr>
+                <w:sz w:val="20"/>
+              </w:rPr>
               <w:t>8378.0</w:t>
             </w:r>
           </w:p>
@@ -1919,6 +2397,9 @@
           </w:tcPr>
           <w:p>
             <w:r>
+              <w:rPr>
+                <w:sz w:val="20"/>
+              </w:rPr>
               <w:t>4.60</w:t>
             </w:r>
           </w:p>
@@ -1929,6 +2410,9 @@
           </w:tcPr>
           <w:p>
             <w:r>
+              <w:rPr>
+                <w:sz w:val="20"/>
+              </w:rPr>
               <w:t>20.8</w:t>
             </w:r>
           </w:p>
@@ -1939,6 +2423,9 @@
           </w:tcPr>
           <w:p>
             <w:r>
+              <w:rPr>
+                <w:sz w:val="20"/>
+              </w:rPr>
               <w:t>15684.4</w:t>
             </w:r>
           </w:p>
@@ -1949,7 +2436,10 @@
           </w:tcPr>
           <w:p>
             <w:r>
-              <w:t>146.6</w:t>
+              <w:rPr>
+                <w:sz w:val="20"/>
+              </w:rPr>
+              <w:t>163.2</w:t>
             </w:r>
           </w:p>
         </w:tc>
@@ -1961,6 +2451,9 @@
           </w:tcPr>
           <w:p>
             <w:r>
+              <w:rPr>
+                <w:sz w:val="20"/>
+              </w:rPr>
               <w:t>60%</w:t>
             </w:r>
           </w:p>
@@ -1971,6 +2464,9 @@
           </w:tcPr>
           <w:p>
             <w:r>
+              <w:rPr>
+                <w:sz w:val="20"/>
+              </w:rPr>
               <w:t>383.5</w:t>
             </w:r>
           </w:p>
@@ -1981,6 +2477,9 @@
           </w:tcPr>
           <w:p>
             <w:r>
+              <w:rPr>
+                <w:sz w:val="20"/>
+              </w:rPr>
               <w:t>7994.5</w:t>
             </w:r>
           </w:p>
@@ -1991,6 +2490,9 @@
           </w:tcPr>
           <w:p>
             <w:r>
+              <w:rPr>
+                <w:sz w:val="20"/>
+              </w:rPr>
               <w:t>8378.0</w:t>
             </w:r>
           </w:p>
@@ -2001,6 +2503,9 @@
           </w:tcPr>
           <w:p>
             <w:r>
+              <w:rPr>
+                <w:sz w:val="20"/>
+              </w:rPr>
               <w:t>4.60</w:t>
             </w:r>
           </w:p>
@@ -2011,6 +2516,9 @@
           </w:tcPr>
           <w:p>
             <w:r>
+              <w:rPr>
+                <w:sz w:val="20"/>
+              </w:rPr>
               <w:t>20.8</w:t>
             </w:r>
           </w:p>
@@ -2021,6 +2529,9 @@
           </w:tcPr>
           <w:p>
             <w:r>
+              <w:rPr>
+                <w:sz w:val="20"/>
+              </w:rPr>
               <w:t>18821.3</w:t>
             </w:r>
           </w:p>
@@ -2031,7 +2542,10 @@
           </w:tcPr>
           <w:p>
             <w:r>
-              <w:t>175.9</w:t>
+              <w:rPr>
+                <w:sz w:val="20"/>
+              </w:rPr>
+              <w:t>195.9</w:t>
             </w:r>
           </w:p>
         </w:tc>
@@ -2043,6 +2557,9 @@
           </w:tcPr>
           <w:p>
             <w:r>
+              <w:rPr>
+                <w:sz w:val="20"/>
+              </w:rPr>
               <w:t>70%</w:t>
             </w:r>
           </w:p>
@@ -2053,6 +2570,9 @@
           </w:tcPr>
           <w:p>
             <w:r>
+              <w:rPr>
+                <w:sz w:val="20"/>
+              </w:rPr>
               <w:t>383.5</w:t>
             </w:r>
           </w:p>
@@ -2063,6 +2583,9 @@
           </w:tcPr>
           <w:p>
             <w:r>
+              <w:rPr>
+                <w:sz w:val="20"/>
+              </w:rPr>
               <w:t>7994.5</w:t>
             </w:r>
           </w:p>
@@ -2073,6 +2596,9 @@
           </w:tcPr>
           <w:p>
             <w:r>
+              <w:rPr>
+                <w:sz w:val="20"/>
+              </w:rPr>
               <w:t>8378.0</w:t>
             </w:r>
           </w:p>
@@ -2083,6 +2609,9 @@
           </w:tcPr>
           <w:p>
             <w:r>
+              <w:rPr>
+                <w:sz w:val="20"/>
+              </w:rPr>
               <w:t>4.60</w:t>
             </w:r>
           </w:p>
@@ -2093,6 +2622,9 @@
           </w:tcPr>
           <w:p>
             <w:r>
+              <w:rPr>
+                <w:sz w:val="20"/>
+              </w:rPr>
               <w:t>20.8</w:t>
             </w:r>
           </w:p>
@@ -2103,6 +2635,9 @@
           </w:tcPr>
           <w:p>
             <w:r>
+              <w:rPr>
+                <w:sz w:val="20"/>
+              </w:rPr>
               <w:t>21958.2</w:t>
             </w:r>
           </w:p>
@@ -2113,7 +2648,10 @@
           </w:tcPr>
           <w:p>
             <w:r>
-              <w:t>205.2</w:t>
+              <w:rPr>
+                <w:sz w:val="20"/>
+              </w:rPr>
+              <w:t>228.5</w:t>
             </w:r>
           </w:p>
         </w:tc>
@@ -2125,6 +2663,9 @@
           </w:tcPr>
           <w:p>
             <w:r>
+              <w:rPr>
+                <w:sz w:val="20"/>
+              </w:rPr>
               <w:t>80%</w:t>
             </w:r>
           </w:p>
@@ -2135,6 +2676,9 @@
           </w:tcPr>
           <w:p>
             <w:r>
+              <w:rPr>
+                <w:sz w:val="20"/>
+              </w:rPr>
               <w:t>383.5</w:t>
             </w:r>
           </w:p>
@@ -2145,6 +2689,9 @@
           </w:tcPr>
           <w:p>
             <w:r>
+              <w:rPr>
+                <w:sz w:val="20"/>
+              </w:rPr>
               <w:t>7994.5</w:t>
             </w:r>
           </w:p>
@@ -2155,6 +2702,9 @@
           </w:tcPr>
           <w:p>
             <w:r>
+              <w:rPr>
+                <w:sz w:val="20"/>
+              </w:rPr>
               <w:t>8378.0</w:t>
             </w:r>
           </w:p>
@@ -2165,6 +2715,9 @@
           </w:tcPr>
           <w:p>
             <w:r>
+              <w:rPr>
+                <w:sz w:val="20"/>
+              </w:rPr>
               <w:t>4.60</w:t>
             </w:r>
           </w:p>
@@ -2175,6 +2728,9 @@
           </w:tcPr>
           <w:p>
             <w:r>
+              <w:rPr>
+                <w:sz w:val="20"/>
+              </w:rPr>
               <w:t>20.8</w:t>
             </w:r>
           </w:p>
@@ -2185,6 +2741,9 @@
           </w:tcPr>
           <w:p>
             <w:r>
+              <w:rPr>
+                <w:sz w:val="20"/>
+              </w:rPr>
               <w:t>25095.1</w:t>
             </w:r>
           </w:p>
@@ -2195,7 +2754,10 @@
           </w:tcPr>
           <w:p>
             <w:r>
-              <w:t>234.5</w:t>
+              <w:rPr>
+                <w:sz w:val="20"/>
+              </w:rPr>
+              <w:t>261.2</w:t>
             </w:r>
           </w:p>
         </w:tc>
@@ -2207,6 +2769,9 @@
           </w:tcPr>
           <w:p>
             <w:r>
+              <w:rPr>
+                <w:sz w:val="20"/>
+              </w:rPr>
               <w:t>90%</w:t>
             </w:r>
           </w:p>
@@ -2217,6 +2782,9 @@
           </w:tcPr>
           <w:p>
             <w:r>
+              <w:rPr>
+                <w:sz w:val="20"/>
+              </w:rPr>
               <w:t>383.5</w:t>
             </w:r>
           </w:p>
@@ -2227,6 +2795,9 @@
           </w:tcPr>
           <w:p>
             <w:r>
+              <w:rPr>
+                <w:sz w:val="20"/>
+              </w:rPr>
               <w:t>7994.5</w:t>
             </w:r>
           </w:p>
@@ -2237,6 +2808,9 @@
           </w:tcPr>
           <w:p>
             <w:r>
+              <w:rPr>
+                <w:sz w:val="20"/>
+              </w:rPr>
               <w:t>8378.0</w:t>
             </w:r>
           </w:p>
@@ -2247,6 +2821,9 @@
           </w:tcPr>
           <w:p>
             <w:r>
+              <w:rPr>
+                <w:sz w:val="20"/>
+              </w:rPr>
               <w:t>4.60</w:t>
             </w:r>
           </w:p>
@@ -2257,6 +2834,9 @@
           </w:tcPr>
           <w:p>
             <w:r>
+              <w:rPr>
+                <w:sz w:val="20"/>
+              </w:rPr>
               <w:t>20.8</w:t>
             </w:r>
           </w:p>
@@ -2267,6 +2847,9 @@
           </w:tcPr>
           <w:p>
             <w:r>
+              <w:rPr>
+                <w:sz w:val="20"/>
+              </w:rPr>
               <w:t>28231.9</w:t>
             </w:r>
           </w:p>
@@ -2277,7 +2860,10 @@
           </w:tcPr>
           <w:p>
             <w:r>
-              <w:t>263.8</w:t>
+              <w:rPr>
+                <w:sz w:val="20"/>
+              </w:rPr>
+              <w:t>293.8</w:t>
             </w:r>
           </w:p>
         </w:tc>
@@ -2289,6 +2875,9 @@
           </w:tcPr>
           <w:p>
             <w:r>
+              <w:rPr>
+                <w:sz w:val="20"/>
+              </w:rPr>
               <w:t>100%</w:t>
             </w:r>
           </w:p>
@@ -2299,6 +2888,9 @@
           </w:tcPr>
           <w:p>
             <w:r>
+              <w:rPr>
+                <w:sz w:val="20"/>
+              </w:rPr>
               <w:t>383.5</w:t>
             </w:r>
           </w:p>
@@ -2309,6 +2901,9 @@
           </w:tcPr>
           <w:p>
             <w:r>
+              <w:rPr>
+                <w:sz w:val="20"/>
+              </w:rPr>
               <w:t>7994.5</w:t>
             </w:r>
           </w:p>
@@ -2319,6 +2914,9 @@
           </w:tcPr>
           <w:p>
             <w:r>
+              <w:rPr>
+                <w:sz w:val="20"/>
+              </w:rPr>
               <w:t>8378.0</w:t>
             </w:r>
           </w:p>
@@ -2329,6 +2927,9 @@
           </w:tcPr>
           <w:p>
             <w:r>
+              <w:rPr>
+                <w:sz w:val="20"/>
+              </w:rPr>
               <w:t>4.60</w:t>
             </w:r>
           </w:p>
@@ -2339,6 +2940,9 @@
           </w:tcPr>
           <w:p>
             <w:r>
+              <w:rPr>
+                <w:sz w:val="20"/>
+              </w:rPr>
               <w:t>20.8</w:t>
             </w:r>
           </w:p>
@@ -2349,6 +2953,9 @@
           </w:tcPr>
           <w:p>
             <w:r>
+              <w:rPr>
+                <w:sz w:val="20"/>
+              </w:rPr>
               <w:t>31368.8</w:t>
             </w:r>
           </w:p>
@@ -2359,7 +2966,760 @@
           </w:tcPr>
           <w:p>
             <w:r>
-              <w:t>293.1</w:t>
+              <w:rPr>
+                <w:sz w:val="20"/>
+              </w:rPr>
+              <w:t>326.4</w:t>
+            </w:r>
+          </w:p>
+        </w:tc>
+      </w:tr>
+    </w:tbl>
+    <w:p/>
+    <w:p>
+      <w:pPr>
+        <w:pStyle w:val="Heading2"/>
+      </w:pPr>
+      <w:r>
+        <w:t>Table 4. Baseline cases per specialist and incremental FP burden</w:t>
+      </w:r>
+    </w:p>
+    <w:tbl>
+      <w:tblPr>
+        <w:tblStyle w:val="TableGrid"/>
+        <w:tblW w:type="auto" w:w="0"/>
+        <w:tblLook w:firstColumn="1" w:firstRow="1" w:lastColumn="0" w:lastRow="0" w:noHBand="0" w:noVBand="1" w:val="04A0"/>
+      </w:tblPr>
+      <w:tblGrid>
+        <w:gridCol w:w="1440"/>
+        <w:gridCol w:w="1440"/>
+        <w:gridCol w:w="1440"/>
+        <w:gridCol w:w="1440"/>
+        <w:gridCol w:w="1440"/>
+        <w:gridCol w:w="1440"/>
+      </w:tblGrid>
+      <w:tr>
+        <w:tc>
+          <w:tcPr>
+            <w:tcW w:type="dxa" w:w="1440"/>
+          </w:tcPr>
+          <w:p>
+            <w:r>
+              <w:rPr>
+                <w:b/>
+                <w:sz w:val="20"/>
+              </w:rPr>
+              <w:t>Cancer</w:t>
+            </w:r>
+          </w:p>
+        </w:tc>
+        <w:tc>
+          <w:tcPr>
+            <w:tcW w:type="dxa" w:w="1440"/>
+          </w:tcPr>
+          <w:p>
+            <w:r>
+              <w:rPr>
+                <w:b/>
+                <w:sz w:val="20"/>
+              </w:rPr>
+              <w:t>Relevant specialty</w:t>
+            </w:r>
+          </w:p>
+        </w:tc>
+        <w:tc>
+          <w:tcPr>
+            <w:tcW w:type="dxa" w:w="1440"/>
+          </w:tcPr>
+          <w:p>
+            <w:r>
+              <w:rPr>
+                <w:b/>
+                <w:sz w:val="20"/>
+              </w:rPr>
+              <w:t>Baseline cases per specialist</w:t>
+            </w:r>
+          </w:p>
+        </w:tc>
+        <w:tc>
+          <w:tcPr>
+            <w:tcW w:type="dxa" w:w="1440"/>
+          </w:tcPr>
+          <w:p>
+            <w:r>
+              <w:rPr>
+                <w:b/>
+                <w:sz w:val="20"/>
+              </w:rPr>
+              <w:t>FP visits per specialist (100k screened)</w:t>
+            </w:r>
+          </w:p>
+        </w:tc>
+        <w:tc>
+          <w:tcPr>
+            <w:tcW w:type="dxa" w:w="1440"/>
+          </w:tcPr>
+          <w:p>
+            <w:r>
+              <w:rPr>
+                <w:b/>
+                <w:sz w:val="20"/>
+              </w:rPr>
+              <w:t>Cases per specialist with FP</w:t>
+            </w:r>
+          </w:p>
+        </w:tc>
+        <w:tc>
+          <w:tcPr>
+            <w:tcW w:type="dxa" w:w="1440"/>
+          </w:tcPr>
+          <w:p>
+            <w:r>
+              <w:rPr>
+                <w:b/>
+                <w:sz w:val="20"/>
+              </w:rPr>
+              <w:t>Increase (%)</w:t>
+            </w:r>
+          </w:p>
+        </w:tc>
+      </w:tr>
+      <w:tr>
+        <w:tc>
+          <w:tcPr>
+            <w:tcW w:type="dxa" w:w="1440"/>
+          </w:tcPr>
+          <w:p>
+            <w:r>
+              <w:rPr>
+                <w:sz w:val="20"/>
+              </w:rPr>
+              <w:t>Gastric</w:t>
+            </w:r>
+          </w:p>
+        </w:tc>
+        <w:tc>
+          <w:tcPr>
+            <w:tcW w:type="dxa" w:w="1440"/>
+          </w:tcPr>
+          <w:p>
+            <w:r>
+              <w:rPr>
+                <w:sz w:val="20"/>
+              </w:rPr>
+              <w:t>Gastroenterology</w:t>
+            </w:r>
+          </w:p>
+        </w:tc>
+        <w:tc>
+          <w:tcPr>
+            <w:tcW w:type="dxa" w:w="1440"/>
+          </w:tcPr>
+          <w:p>
+            <w:r>
+              <w:rPr>
+                <w:sz w:val="20"/>
+              </w:rPr>
+              <w:t>11.9</w:t>
+            </w:r>
+          </w:p>
+        </w:tc>
+        <w:tc>
+          <w:tcPr>
+            <w:tcW w:type="dxa" w:w="1440"/>
+          </w:tcPr>
+          <w:p>
+            <w:r>
+              <w:rPr>
+                <w:sz w:val="20"/>
+              </w:rPr>
+              <w:t>73.25</w:t>
+            </w:r>
+          </w:p>
+        </w:tc>
+        <w:tc>
+          <w:tcPr>
+            <w:tcW w:type="dxa" w:w="1440"/>
+          </w:tcPr>
+          <w:p>
+            <w:r>
+              <w:rPr>
+                <w:sz w:val="20"/>
+              </w:rPr>
+              <w:t>85.1</w:t>
+            </w:r>
+          </w:p>
+        </w:tc>
+        <w:tc>
+          <w:tcPr>
+            <w:tcW w:type="dxa" w:w="1440"/>
+          </w:tcPr>
+          <w:p>
+            <w:r>
+              <w:rPr>
+                <w:sz w:val="20"/>
+              </w:rPr>
+              <w:t>618.0</w:t>
+            </w:r>
+          </w:p>
+        </w:tc>
+      </w:tr>
+      <w:tr>
+        <w:tc>
+          <w:tcPr>
+            <w:tcW w:type="dxa" w:w="1440"/>
+          </w:tcPr>
+          <w:p>
+            <w:r>
+              <w:rPr>
+                <w:sz w:val="20"/>
+              </w:rPr>
+              <w:t>Colorectal</w:t>
+            </w:r>
+          </w:p>
+        </w:tc>
+        <w:tc>
+          <w:tcPr>
+            <w:tcW w:type="dxa" w:w="1440"/>
+          </w:tcPr>
+          <w:p>
+            <w:r>
+              <w:rPr>
+                <w:sz w:val="20"/>
+              </w:rPr>
+              <w:t>Gastrointestinal Surgery</w:t>
+            </w:r>
+          </w:p>
+        </w:tc>
+        <w:tc>
+          <w:tcPr>
+            <w:tcW w:type="dxa" w:w="1440"/>
+          </w:tcPr>
+          <w:p>
+            <w:r>
+              <w:rPr>
+                <w:sz w:val="20"/>
+              </w:rPr>
+              <w:t>63.4</w:t>
+            </w:r>
+          </w:p>
+        </w:tc>
+        <w:tc>
+          <w:tcPr>
+            <w:tcW w:type="dxa" w:w="1440"/>
+          </w:tcPr>
+          <w:p>
+            <w:r>
+              <w:rPr>
+                <w:sz w:val="20"/>
+              </w:rPr>
+              <w:t>205.25</w:t>
+            </w:r>
+          </w:p>
+        </w:tc>
+        <w:tc>
+          <w:tcPr>
+            <w:tcW w:type="dxa" w:w="1440"/>
+          </w:tcPr>
+          <w:p>
+            <w:r>
+              <w:rPr>
+                <w:sz w:val="20"/>
+              </w:rPr>
+              <w:t>268.7</w:t>
+            </w:r>
+          </w:p>
+        </w:tc>
+        <w:tc>
+          <w:tcPr>
+            <w:tcW w:type="dxa" w:w="1440"/>
+          </w:tcPr>
+          <w:p>
+            <w:r>
+              <w:rPr>
+                <w:sz w:val="20"/>
+              </w:rPr>
+              <w:t>323.6</w:t>
+            </w:r>
+          </w:p>
+        </w:tc>
+      </w:tr>
+      <w:tr>
+        <w:tc>
+          <w:tcPr>
+            <w:tcW w:type="dxa" w:w="1440"/>
+          </w:tcPr>
+          <w:p>
+            <w:r>
+              <w:rPr>
+                <w:sz w:val="20"/>
+              </w:rPr>
+              <w:t>Lung</w:t>
+            </w:r>
+          </w:p>
+        </w:tc>
+        <w:tc>
+          <w:tcPr>
+            <w:tcW w:type="dxa" w:w="1440"/>
+          </w:tcPr>
+          <w:p>
+            <w:r>
+              <w:rPr>
+                <w:sz w:val="20"/>
+              </w:rPr>
+              <w:t>Respiratory Medicine</w:t>
+            </w:r>
+          </w:p>
+        </w:tc>
+        <w:tc>
+          <w:tcPr>
+            <w:tcW w:type="dxa" w:w="1440"/>
+          </w:tcPr>
+          <w:p>
+            <w:r>
+              <w:rPr>
+                <w:sz w:val="20"/>
+              </w:rPr>
+              <w:t>43.9</w:t>
+            </w:r>
+          </w:p>
+        </w:tc>
+        <w:tc>
+          <w:tcPr>
+            <w:tcW w:type="dxa" w:w="1440"/>
+          </w:tcPr>
+          <w:p>
+            <w:r>
+              <w:rPr>
+                <w:sz w:val="20"/>
+              </w:rPr>
+              <w:t>279.66</w:t>
+            </w:r>
+          </w:p>
+        </w:tc>
+        <w:tc>
+          <w:tcPr>
+            <w:tcW w:type="dxa" w:w="1440"/>
+          </w:tcPr>
+          <w:p>
+            <w:r>
+              <w:rPr>
+                <w:sz w:val="20"/>
+              </w:rPr>
+              <w:t>323.5</w:t>
+            </w:r>
+          </w:p>
+        </w:tc>
+        <w:tc>
+          <w:tcPr>
+            <w:tcW w:type="dxa" w:w="1440"/>
+          </w:tcPr>
+          <w:p>
+            <w:r>
+              <w:rPr>
+                <w:sz w:val="20"/>
+              </w:rPr>
+              <w:t>637.8</w:t>
+            </w:r>
+          </w:p>
+        </w:tc>
+      </w:tr>
+      <w:tr>
+        <w:tc>
+          <w:tcPr>
+            <w:tcW w:type="dxa" w:w="1440"/>
+          </w:tcPr>
+          <w:p>
+            <w:r>
+              <w:rPr>
+                <w:sz w:val="20"/>
+              </w:rPr>
+              <w:t>Breast</w:t>
+            </w:r>
+          </w:p>
+        </w:tc>
+        <w:tc>
+          <w:tcPr>
+            <w:tcW w:type="dxa" w:w="1440"/>
+          </w:tcPr>
+          <w:p>
+            <w:r>
+              <w:rPr>
+                <w:sz w:val="20"/>
+              </w:rPr>
+              <w:t>Breast Surgery</w:t>
+            </w:r>
+          </w:p>
+        </w:tc>
+        <w:tc>
+          <w:tcPr>
+            <w:tcW w:type="dxa" w:w="1440"/>
+          </w:tcPr>
+          <w:p>
+            <w:r>
+              <w:rPr>
+                <w:sz w:val="20"/>
+              </w:rPr>
+              <w:t>403.5</w:t>
+            </w:r>
+          </w:p>
+        </w:tc>
+        <w:tc>
+          <w:tcPr>
+            <w:tcW w:type="dxa" w:w="1440"/>
+          </w:tcPr>
+          <w:p>
+            <w:r>
+              <w:rPr>
+                <w:sz w:val="20"/>
+              </w:rPr>
+              <w:t>892.48</w:t>
+            </w:r>
+          </w:p>
+        </w:tc>
+        <w:tc>
+          <w:tcPr>
+            <w:tcW w:type="dxa" w:w="1440"/>
+          </w:tcPr>
+          <w:p>
+            <w:r>
+              <w:rPr>
+                <w:sz w:val="20"/>
+              </w:rPr>
+              <w:t>1296.0</w:t>
+            </w:r>
+          </w:p>
+        </w:tc>
+        <w:tc>
+          <w:tcPr>
+            <w:tcW w:type="dxa" w:w="1440"/>
+          </w:tcPr>
+          <w:p>
+            <w:r>
+              <w:rPr>
+                <w:sz w:val="20"/>
+              </w:rPr>
+              <w:t>221.2</w:t>
+            </w:r>
+          </w:p>
+        </w:tc>
+      </w:tr>
+      <w:tr>
+        <w:tc>
+          <w:tcPr>
+            <w:tcW w:type="dxa" w:w="1440"/>
+          </w:tcPr>
+          <w:p>
+            <w:r>
+              <w:rPr>
+                <w:sz w:val="20"/>
+              </w:rPr>
+              <w:t>Prostate</w:t>
+            </w:r>
+          </w:p>
+        </w:tc>
+        <w:tc>
+          <w:tcPr>
+            <w:tcW w:type="dxa" w:w="1440"/>
+          </w:tcPr>
+          <w:p>
+            <w:r>
+              <w:rPr>
+                <w:sz w:val="20"/>
+              </w:rPr>
+              <w:t>Urology</w:t>
+            </w:r>
+          </w:p>
+        </w:tc>
+        <w:tc>
+          <w:tcPr>
+            <w:tcW w:type="dxa" w:w="1440"/>
+          </w:tcPr>
+          <w:p>
+            <w:r>
+              <w:rPr>
+                <w:sz w:val="20"/>
+              </w:rPr>
+              <w:t>85.5</w:t>
+            </w:r>
+          </w:p>
+        </w:tc>
+        <w:tc>
+          <w:tcPr>
+            <w:tcW w:type="dxa" w:w="1440"/>
+          </w:tcPr>
+          <w:p>
+            <w:r>
+              <w:rPr>
+                <w:sz w:val="20"/>
+              </w:rPr>
+              <w:t>241.77</w:t>
+            </w:r>
+          </w:p>
+        </w:tc>
+        <w:tc>
+          <w:tcPr>
+            <w:tcW w:type="dxa" w:w="1440"/>
+          </w:tcPr>
+          <w:p>
+            <w:r>
+              <w:rPr>
+                <w:sz w:val="20"/>
+              </w:rPr>
+              <w:t>327.3</w:t>
+            </w:r>
+          </w:p>
+        </w:tc>
+        <w:tc>
+          <w:tcPr>
+            <w:tcW w:type="dxa" w:w="1440"/>
+          </w:tcPr>
+          <w:p>
+            <w:r>
+              <w:rPr>
+                <w:sz w:val="20"/>
+              </w:rPr>
+              <w:t>282.7</w:t>
+            </w:r>
+          </w:p>
+        </w:tc>
+      </w:tr>
+      <w:tr>
+        <w:tc>
+          <w:tcPr>
+            <w:tcW w:type="dxa" w:w="1440"/>
+          </w:tcPr>
+          <w:p>
+            <w:r>
+              <w:rPr>
+                <w:sz w:val="20"/>
+              </w:rPr>
+              <w:t>Liver</w:t>
+            </w:r>
+          </w:p>
+        </w:tc>
+        <w:tc>
+          <w:tcPr>
+            <w:tcW w:type="dxa" w:w="1440"/>
+          </w:tcPr>
+          <w:p>
+            <w:r>
+              <w:rPr>
+                <w:sz w:val="20"/>
+              </w:rPr>
+              <w:t>Hepatology</w:t>
+            </w:r>
+          </w:p>
+        </w:tc>
+        <w:tc>
+          <w:tcPr>
+            <w:tcW w:type="dxa" w:w="1440"/>
+          </w:tcPr>
+          <w:p>
+            <w:r>
+              <w:rPr>
+                <w:sz w:val="20"/>
+              </w:rPr>
+              <w:t>10.1</w:t>
+            </w:r>
+          </w:p>
+        </w:tc>
+        <w:tc>
+          <w:tcPr>
+            <w:tcW w:type="dxa" w:w="1440"/>
+          </w:tcPr>
+          <w:p>
+            <w:r>
+              <w:rPr>
+                <w:sz w:val="20"/>
+              </w:rPr>
+              <w:t>201.38</w:t>
+            </w:r>
+          </w:p>
+        </w:tc>
+        <w:tc>
+          <w:tcPr>
+            <w:tcW w:type="dxa" w:w="1440"/>
+          </w:tcPr>
+          <w:p>
+            <w:r>
+              <w:rPr>
+                <w:sz w:val="20"/>
+              </w:rPr>
+              <w:t>211.5</w:t>
+            </w:r>
+          </w:p>
+        </w:tc>
+        <w:tc>
+          <w:tcPr>
+            <w:tcW w:type="dxa" w:w="1440"/>
+          </w:tcPr>
+          <w:p>
+            <w:r>
+              <w:rPr>
+                <w:sz w:val="20"/>
+              </w:rPr>
+              <w:t>1989.0</w:t>
+            </w:r>
+          </w:p>
+        </w:tc>
+      </w:tr>
+      <w:tr>
+        <w:tc>
+          <w:tcPr>
+            <w:tcW w:type="dxa" w:w="1440"/>
+          </w:tcPr>
+          <w:p>
+            <w:r>
+              <w:rPr>
+                <w:sz w:val="20"/>
+              </w:rPr>
+              <w:t>Pancreatic</w:t>
+            </w:r>
+          </w:p>
+        </w:tc>
+        <w:tc>
+          <w:tcPr>
+            <w:tcW w:type="dxa" w:w="1440"/>
+          </w:tcPr>
+          <w:p>
+            <w:r>
+              <w:rPr>
+                <w:sz w:val="20"/>
+              </w:rPr>
+              <w:t>Gastroenterology</w:t>
+            </w:r>
+          </w:p>
+        </w:tc>
+        <w:tc>
+          <w:tcPr>
+            <w:tcW w:type="dxa" w:w="1440"/>
+          </w:tcPr>
+          <w:p>
+            <w:r>
+              <w:rPr>
+                <w:sz w:val="20"/>
+              </w:rPr>
+              <w:t>3.8</w:t>
+            </w:r>
+          </w:p>
+        </w:tc>
+        <w:tc>
+          <w:tcPr>
+            <w:tcW w:type="dxa" w:w="1440"/>
+          </w:tcPr>
+          <w:p>
+            <w:r>
+              <w:rPr>
+                <w:sz w:val="20"/>
+              </w:rPr>
+              <w:t>82.86</w:t>
+            </w:r>
+          </w:p>
+        </w:tc>
+        <w:tc>
+          <w:tcPr>
+            <w:tcW w:type="dxa" w:w="1440"/>
+          </w:tcPr>
+          <w:p>
+            <w:r>
+              <w:rPr>
+                <w:sz w:val="20"/>
+              </w:rPr>
+              <w:t>86.6</w:t>
+            </w:r>
+          </w:p>
+        </w:tc>
+        <w:tc>
+          <w:tcPr>
+            <w:tcW w:type="dxa" w:w="1440"/>
+          </w:tcPr>
+          <w:p>
+            <w:r>
+              <w:rPr>
+                <w:sz w:val="20"/>
+              </w:rPr>
+              <w:t>2207.1</w:t>
+            </w:r>
+          </w:p>
+        </w:tc>
+      </w:tr>
+      <w:tr>
+        <w:tc>
+          <w:tcPr>
+            <w:tcW w:type="dxa" w:w="1440"/>
+          </w:tcPr>
+          <w:p>
+            <w:r>
+              <w:rPr>
+                <w:sz w:val="20"/>
+              </w:rPr>
+              <w:t>Ovarian</w:t>
+            </w:r>
+          </w:p>
+        </w:tc>
+        <w:tc>
+          <w:tcPr>
+            <w:tcW w:type="dxa" w:w="1440"/>
+          </w:tcPr>
+          <w:p>
+            <w:r>
+              <w:rPr>
+                <w:sz w:val="20"/>
+              </w:rPr>
+              <w:t>Obstetrics and Gynaecology</w:t>
+            </w:r>
+          </w:p>
+        </w:tc>
+        <w:tc>
+          <w:tcPr>
+            <w:tcW w:type="dxa" w:w="1440"/>
+          </w:tcPr>
+          <w:p>
+            <w:r>
+              <w:rPr>
+                <w:sz w:val="20"/>
+              </w:rPr>
+              <w:t>2.2</w:t>
+            </w:r>
+          </w:p>
+        </w:tc>
+        <w:tc>
+          <w:tcPr>
+            <w:tcW w:type="dxa" w:w="1440"/>
+          </w:tcPr>
+          <w:p>
+            <w:r>
+              <w:rPr>
+                <w:sz w:val="20"/>
+              </w:rPr>
+              <w:t>86.07</w:t>
+            </w:r>
+          </w:p>
+        </w:tc>
+        <w:tc>
+          <w:tcPr>
+            <w:tcW w:type="dxa" w:w="1440"/>
+          </w:tcPr>
+          <w:p>
+            <w:r>
+              <w:rPr>
+                <w:sz w:val="20"/>
+              </w:rPr>
+              <w:t>88.2</w:t>
+            </w:r>
+          </w:p>
+        </w:tc>
+        <w:tc>
+          <w:tcPr>
+            <w:tcW w:type="dxa" w:w="1440"/>
+          </w:tcPr>
+          <w:p>
+            <w:r>
+              <w:rPr>
+                <w:sz w:val="20"/>
+              </w:rPr>
+              <w:t>3941.5</w:t>
             </w:r>
           </w:p>
         </w:tc>

</xml_diff>